<commit_message>
~UL89 exon annotation (UL89_3 and UL89_1)
</commit_message>
<xml_diff>
--- a/data/db/cmv/template.docx
+++ b/data/db/cmv/template.docx
@@ -22,25 +22,7 @@
         </w:rPr>
         <w:t xml:space="preserve">Interprétation de mutations génotypiques pour </w:t>
         <w:br/>
-        <w:t>la résistance aux antiviraux (</w:t>
-      </w:r>
-      <w:r>
-        <w:rPr>
-          <w:color w:val="215E99" w:themeColor="text2" w:themeTint="bf"/>
-          <w:sz w:val="32"/>
-          <w:szCs w:val="32"/>
-          <w:lang w:val="fr-CH"/>
-        </w:rPr>
-        <w:t>CMV</w:t>
-      </w:r>
-      <w:r>
-        <w:rPr>
-          <w:color w:val="215E99" w:themeColor="text2" w:themeTint="bf"/>
-          <w:sz w:val="32"/>
-          <w:szCs w:val="32"/>
-          <w:lang w:val="fr-CH"/>
-        </w:rPr>
-        <w:t>)</w:t>
+        <w:t>la résistance aux antiviraux (CMV)</w:t>
       </w:r>
     </w:p>
     <w:tbl>
@@ -634,8 +616,8 @@
         </w:rPr>
         <w:t>Résultat du séquençage du gène UL</w:t>
       </w:r>
-      <w:bookmarkStart w:id="0" w:name="_Ref170228463"/>
-      <w:bookmarkStart w:id="1" w:name="_Ref170228208"/>
+      <w:bookmarkStart w:id="0" w:name="_Ref170228208"/>
+      <w:bookmarkStart w:id="1" w:name="_Ref170228463"/>
       <w:bookmarkEnd w:id="0"/>
       <w:bookmarkEnd w:id="1"/>
       <w:r>
@@ -693,8 +675,8 @@
         </w:rPr>
         <w:t>Résultat du séquençage du gène UL</w:t>
       </w:r>
-      <w:bookmarkStart w:id="2" w:name="_Ref17022820811"/>
-      <w:bookmarkStart w:id="3" w:name="_Ref17022846311"/>
+      <w:bookmarkStart w:id="2" w:name="_Ref17022846311"/>
+      <w:bookmarkStart w:id="3" w:name="_Ref17022820811"/>
       <w:bookmarkEnd w:id="2"/>
       <w:bookmarkEnd w:id="3"/>
       <w:r>
@@ -806,8 +788,8 @@
         </w:rPr>
         <w:t>Résultat du séquençage du gène UL</w:t>
       </w:r>
-      <w:bookmarkStart w:id="4" w:name="_Ref1702282081"/>
-      <w:bookmarkStart w:id="5" w:name="_Ref1702284631"/>
+      <w:bookmarkStart w:id="4" w:name="_Ref1702284631"/>
+      <w:bookmarkStart w:id="5" w:name="_Ref1702282081"/>
       <w:bookmarkEnd w:id="4"/>
       <w:bookmarkEnd w:id="5"/>
       <w:r>
@@ -1096,13 +1078,25 @@
           <w:szCs w:val="28"/>
           <w:lang w:val="fr-CH"/>
         </w:rPr>
-        <w:t xml:space="preserve">(intron 1) </w:t>
-      </w:r>
-      <w:r>
-        <w:rPr>
-          <w:lang w:val="fr-CH"/>
-        </w:rPr>
-        <w:t xml:space="preserve">RES-UL89i1-HHV5 </w:t>
+        <w:t xml:space="preserve">(UL89_3) </w:t>
+      </w:r>
+      <w:r>
+        <w:rPr>
+          <w:lang w:val="fr-CH"/>
+        </w:rPr>
+        <w:t>RES-UL89_</w:t>
+      </w:r>
+      <w:r>
+        <w:rPr>
+          <w:lang w:val="fr-CH"/>
+        </w:rPr>
+        <w:t>3</w:t>
+      </w:r>
+      <w:r>
+        <w:rPr>
+          <w:lang w:val="fr-CH"/>
+        </w:rPr>
+        <w:t xml:space="preserve">-HHV5 </w:t>
       </w:r>
     </w:p>
     <w:p>
@@ -1211,13 +1205,25 @@
           <w:szCs w:val="28"/>
           <w:lang w:val="fr-CH"/>
         </w:rPr>
-        <w:t xml:space="preserve">(intron 2) </w:t>
-      </w:r>
-      <w:r>
-        <w:rPr>
-          <w:lang w:val="fr-CH"/>
-        </w:rPr>
-        <w:t>RES-UL89i2-HHV5</w:t>
+        <w:t xml:space="preserve">(UL89_1) </w:t>
+      </w:r>
+      <w:r>
+        <w:rPr>
+          <w:lang w:val="fr-CH"/>
+        </w:rPr>
+        <w:t>RES-UL89_</w:t>
+      </w:r>
+      <w:r>
+        <w:rPr>
+          <w:lang w:val="fr-CH"/>
+        </w:rPr>
+        <w:t>1</w:t>
+      </w:r>
+      <w:r>
+        <w:rPr>
+          <w:lang w:val="fr-CH"/>
+        </w:rPr>
+        <w:t>-HHV5</w:t>
       </w:r>
     </w:p>
     <w:p>

</xml_diff>

<commit_message>
~ Apply +888 nt offset and +296 AA offset for UL89_1-HHV5 in reports
</commit_message>
<xml_diff>
--- a/data/db/cmv/template.docx
+++ b/data/db/cmv/template.docx
@@ -616,8 +616,8 @@
         </w:rPr>
         <w:t>Résultat du séquençage du gène UL</w:t>
       </w:r>
-      <w:bookmarkStart w:id="0" w:name="_Ref170228208"/>
-      <w:bookmarkStart w:id="1" w:name="_Ref170228463"/>
+      <w:bookmarkStart w:id="0" w:name="_Ref170228463"/>
+      <w:bookmarkStart w:id="1" w:name="_Ref170228208"/>
       <w:bookmarkEnd w:id="0"/>
       <w:bookmarkEnd w:id="1"/>
       <w:r>
@@ -644,19 +644,6 @@
           <w:lang w:val="fr-CH"/>
         </w:rPr>
         <w:t xml:space="preserve"> RES-UL27-HHV5</w:t>
-      </w:r>
-    </w:p>
-    <w:p>
-      <w:pPr>
-        <w:pStyle w:val="Normal"/>
-        <w:rPr>
-          <w:lang w:val="fr-CH"/>
-        </w:rPr>
-      </w:pPr>
-      <w:r>
-        <w:rPr>
-          <w:lang w:val="fr-CH"/>
-        </w:rPr>
       </w:r>
     </w:p>
     <w:p>
@@ -667,109 +654,7 @@
         </w:rPr>
       </w:pPr>
       <w:r>
-        <w:rPr>
-          <w:color w:val="215E99" w:themeColor="text2" w:themeTint="bf"/>
-          <w:sz w:val="28"/>
-          <w:szCs w:val="28"/>
-          <w:lang w:val="fr-CH"/>
-        </w:rPr>
-        <w:t>Résultat du séquençage du gène UL</w:t>
-      </w:r>
-      <w:bookmarkStart w:id="2" w:name="_Ref17022846311"/>
-      <w:bookmarkStart w:id="3" w:name="_Ref17022820811"/>
-      <w:bookmarkEnd w:id="2"/>
-      <w:bookmarkEnd w:id="3"/>
-      <w:r>
-        <w:rPr>
-          <w:color w:val="215E99" w:themeColor="text2" w:themeTint="bf"/>
-          <w:sz w:val="28"/>
-          <w:szCs w:val="28"/>
-          <w:lang w:val="fr-CH"/>
-        </w:rPr>
-        <w:t>51</w:t>
-      </w:r>
-      <w:r>
-        <w:fldChar w:fldCharType="begin"/>
-      </w:r>
-      <w:r>
-        <w:rPr>
-          <w:sz w:val="28"/>
-          <w:szCs w:val="28"/>
-          <w:color w:val="215E99"/>
-          <w:lang w:val="fr-CH"/>
-        </w:rPr>
-        <w:instrText xml:space="preserve">NOTEREF _Ref170228208 \h  \* MERGEFORMAT</w:instrText>
-      </w:r>
-      <w:r>
-        <w:rPr>
-          <w:color w:val="215E99" w:themeColor="text2" w:themeTint="bf"/>
-          <w:sz w:val="28"/>
-          <w:szCs w:val="28"/>
-          <w:lang w:val="fr-CH"/>
-        </w:rPr>
-      </w:r>
-      <w:r>
-        <w:rPr>
-          <w:sz w:val="28"/>
-          <w:szCs w:val="28"/>
-          <w:color w:val="215E99"/>
-          <w:lang w:val="fr-CH"/>
-        </w:rPr>
-        <w:fldChar w:fldCharType="separate"/>
-      </w:r>
-      <w:r>
-        <w:rPr>
-          <w:color w:val="215E99" w:themeColor="text2" w:themeTint="bf"/>
-          <w:sz w:val="28"/>
-          <w:szCs w:val="28"/>
-          <w:lang w:val="fr-CH"/>
-        </w:rPr>
-      </w:r>
-      <w:r>
-        <w:rPr>
-          <w:color w:val="215E99" w:themeColor="text2" w:themeTint="bf"/>
-          <w:sz w:val="28"/>
-          <w:szCs w:val="28"/>
-          <w:vertAlign w:val="superscript"/>
-          <w:lang w:val="fr-CH"/>
-        </w:rPr>
-        <w:t>1</w:t>
-      </w:r>
-      <w:r>
-        <w:rPr>
-          <w:color w:val="215E99" w:themeColor="text2" w:themeTint="bf"/>
-          <w:sz w:val="28"/>
-          <w:szCs w:val="28"/>
-          <w:lang w:val="fr-CH"/>
-        </w:rPr>
-      </w:r>
-      <w:r>
-        <w:rPr>
-          <w:sz w:val="28"/>
-          <w:szCs w:val="28"/>
-          <w:color w:val="215E99"/>
-          <w:lang w:val="fr-CH"/>
-        </w:rPr>
-        <w:fldChar w:fldCharType="end"/>
-      </w:r>
-      <w:r>
-        <w:rPr>
-          <w:lang w:val="fr-CH"/>
-        </w:rPr>
-        <w:t xml:space="preserve"> RES-UL51-HHV5</w:t>
-      </w:r>
-    </w:p>
-    <w:p>
-      <w:pPr>
-        <w:pStyle w:val="Normal"/>
-        <w:rPr>
-          <w:lang w:val="fr-CH"/>
-        </w:rPr>
-      </w:pPr>
-      <w:r>
-        <w:rPr>
-          <w:lang w:val="fr-CH"/>
-        </w:rPr>
+        <w:rPr/>
       </w:r>
     </w:p>
     <w:p>
@@ -788,10 +673,10 @@
         </w:rPr>
         <w:t>Résultat du séquençage du gène UL</w:t>
       </w:r>
-      <w:bookmarkStart w:id="4" w:name="_Ref1702284631"/>
-      <w:bookmarkStart w:id="5" w:name="_Ref1702282081"/>
-      <w:bookmarkEnd w:id="4"/>
-      <w:bookmarkEnd w:id="5"/>
+      <w:bookmarkStart w:id="2" w:name="_Ref17022820811"/>
+      <w:bookmarkStart w:id="3" w:name="_Ref17022846311"/>
+      <w:bookmarkEnd w:id="2"/>
+      <w:bookmarkEnd w:id="3"/>
       <w:r>
         <w:rPr>
           <w:color w:val="215E99" w:themeColor="text2" w:themeTint="bf"/>
@@ -799,7 +684,7 @@
           <w:szCs w:val="28"/>
           <w:lang w:val="fr-CH"/>
         </w:rPr>
-        <w:t>54</w:t>
+        <w:t>51</w:t>
       </w:r>
       <w:r>
         <w:fldChar w:fldCharType="begin"/>
@@ -869,7 +754,7 @@
         <w:rPr>
           <w:lang w:val="fr-CH"/>
         </w:rPr>
-        <w:t xml:space="preserve"> RES-UL54-HHV5</w:t>
+        <w:t xml:space="preserve"> RES-UL51-HHV5</w:t>
       </w:r>
     </w:p>
     <w:p>
@@ -880,9 +765,7 @@
         </w:rPr>
       </w:pPr>
       <w:r>
-        <w:rPr>
-          <w:lang w:val="fr-CH"/>
-        </w:rPr>
+        <w:rPr/>
       </w:r>
     </w:p>
     <w:p>
@@ -899,7 +782,20 @@
           <w:szCs w:val="28"/>
           <w:lang w:val="fr-CH"/>
         </w:rPr>
-        <w:t>Résultat du séquençage du gène UL56</w:t>
+        <w:t>Résultat du séquençage du gène UL</w:t>
+      </w:r>
+      <w:bookmarkStart w:id="4" w:name="_Ref1702282081"/>
+      <w:bookmarkStart w:id="5" w:name="_Ref1702284631"/>
+      <w:bookmarkEnd w:id="4"/>
+      <w:bookmarkEnd w:id="5"/>
+      <w:r>
+        <w:rPr>
+          <w:color w:val="215E99" w:themeColor="text2" w:themeTint="bf"/>
+          <w:sz w:val="28"/>
+          <w:szCs w:val="28"/>
+          <w:lang w:val="fr-CH"/>
+        </w:rPr>
+        <w:t>54</w:t>
       </w:r>
       <w:r>
         <w:fldChar w:fldCharType="begin"/>
@@ -969,7 +865,7 @@
         <w:rPr>
           <w:lang w:val="fr-CH"/>
         </w:rPr>
-        <w:t xml:space="preserve"> RES-UL56-HHV5</w:t>
+        <w:t xml:space="preserve"> RES-UL54-HHV5</w:t>
       </w:r>
     </w:p>
     <w:p>
@@ -999,7 +895,7 @@
           <w:szCs w:val="28"/>
           <w:lang w:val="fr-CH"/>
         </w:rPr>
-        <w:t>Résultat du séquençage du gène UL89</w:t>
+        <w:t>Résultat du séquençage du gène UL56</w:t>
       </w:r>
       <w:r>
         <w:fldChar w:fldCharType="begin"/>
@@ -1011,7 +907,7 @@
           <w:color w:val="215E99"/>
           <w:lang w:val="fr-CH"/>
         </w:rPr>
-        <w:instrText xml:space="preserve">vnd.oasis.opendocument.field.UNHANDLED</w:instrText>
+        <w:instrText xml:space="preserve">NOTEREF _Ref170228208 \h  \* MERGEFORMAT</w:instrText>
       </w:r>
       <w:r>
         <w:rPr>
@@ -1069,34 +965,7 @@
         <w:rPr>
           <w:lang w:val="fr-CH"/>
         </w:rPr>
-        <w:t xml:space="preserve"> </w:t>
-      </w:r>
-      <w:r>
-        <w:rPr>
-          <w:color w:val="215E99" w:themeColor="text2" w:themeTint="bf"/>
-          <w:sz w:val="28"/>
-          <w:szCs w:val="28"/>
-          <w:lang w:val="fr-CH"/>
-        </w:rPr>
-        <w:t xml:space="preserve">(UL89_3) </w:t>
-      </w:r>
-      <w:r>
-        <w:rPr>
-          <w:lang w:val="fr-CH"/>
-        </w:rPr>
-        <w:t>RES-UL89_</w:t>
-      </w:r>
-      <w:r>
-        <w:rPr>
-          <w:lang w:val="fr-CH"/>
-        </w:rPr>
-        <w:t>3</w:t>
-      </w:r>
-      <w:r>
-        <w:rPr>
-          <w:lang w:val="fr-CH"/>
-        </w:rPr>
-        <w:t xml:space="preserve">-HHV5 </w:t>
+        <w:t xml:space="preserve"> RES-UL56-HHV5</w:t>
       </w:r>
     </w:p>
     <w:p>
@@ -1196,34 +1065,7 @@
         <w:rPr>
           <w:lang w:val="fr-CH"/>
         </w:rPr>
-        <w:t xml:space="preserve"> </w:t>
-      </w:r>
-      <w:r>
-        <w:rPr>
-          <w:color w:val="215E99" w:themeColor="text2" w:themeTint="bf"/>
-          <w:sz w:val="28"/>
-          <w:szCs w:val="28"/>
-          <w:lang w:val="fr-CH"/>
-        </w:rPr>
-        <w:t xml:space="preserve">(UL89_1) </w:t>
-      </w:r>
-      <w:r>
-        <w:rPr>
-          <w:lang w:val="fr-CH"/>
-        </w:rPr>
-        <w:t>RES-UL89_</w:t>
-      </w:r>
-      <w:r>
-        <w:rPr>
-          <w:lang w:val="fr-CH"/>
-        </w:rPr>
-        <w:t>1</w:t>
-      </w:r>
-      <w:r>
-        <w:rPr>
-          <w:lang w:val="fr-CH"/>
-        </w:rPr>
-        <w:t>-HHV5</w:t>
+        <w:t xml:space="preserve"> RES-UL89-HHV5</w:t>
       </w:r>
     </w:p>
     <w:p>

</xml_diff>

<commit_message>
Update report template with DB metadata placeholders
</commit_message>
<xml_diff>
--- a/data/db/cmv/template.docx
+++ b/data/db/cmv/template.docx
@@ -45,7 +45,7 @@
         <w:gridCol w:w="2267"/>
         <w:gridCol w:w="1985"/>
         <w:gridCol w:w="1844"/>
-        <w:gridCol w:w="2834"/>
+        <w:gridCol w:w="2835"/>
       </w:tblGrid>
       <w:tr>
         <w:trPr>
@@ -159,7 +159,7 @@
         </w:tc>
         <w:tc>
           <w:tcPr>
-            <w:tcW w:w="2834" w:type="dxa"/>
+            <w:tcW w:w="2835" w:type="dxa"/>
             <w:tcBorders>
               <w:left w:val="nil"/>
               <w:bottom w:val="nil"/>
@@ -250,7 +250,8 @@
               <w:spacing w:lineRule="auto" w:line="240" w:before="0" w:after="0"/>
               <w:jc w:val="left"/>
               <w:rPr>
-                <w:u w:val="none"/>
+                <w:sz w:val="22"/>
+                <w:szCs w:val="22"/>
               </w:rPr>
             </w:pPr>
             <w:r>
@@ -259,7 +260,6 @@
                 <w:kern w:val="2"/>
                 <w:sz w:val="22"/>
                 <w:szCs w:val="22"/>
-                <w:u w:val="none"/>
                 <w:lang w:eastAsia="en-US" w:bidi="ar-SA"/>
               </w:rPr>
               <w:t>IDPATIENT</w:t>
@@ -304,7 +304,7 @@
         </w:tc>
         <w:tc>
           <w:tcPr>
-            <w:tcW w:w="2834" w:type="dxa"/>
+            <w:tcW w:w="2835" w:type="dxa"/>
             <w:tcBorders>
               <w:top w:val="nil"/>
               <w:left w:val="nil"/>
@@ -320,20 +320,12 @@
               <w:spacing w:lineRule="auto" w:line="240" w:before="0" w:after="0"/>
               <w:jc w:val="left"/>
               <w:rPr>
-                <w:b/>
-                <w:b/>
-                <w:bCs/>
                 <w:sz w:val="22"/>
                 <w:szCs w:val="22"/>
               </w:rPr>
             </w:pPr>
             <w:r>
-              <w:rPr>
-                <w:b/>
-                <w:bCs/>
-                <w:sz w:val="22"/>
-                <w:szCs w:val="22"/>
-              </w:rPr>
+              <w:rPr/>
             </w:r>
           </w:p>
         </w:tc>
@@ -445,7 +437,7 @@
         </w:tc>
         <w:tc>
           <w:tcPr>
-            <w:tcW w:w="2834" w:type="dxa"/>
+            <w:tcW w:w="2835" w:type="dxa"/>
             <w:tcBorders>
               <w:top w:val="nil"/>
               <w:left w:val="nil"/>
@@ -476,12 +468,281 @@
               <w:t>_VERSIONLOGICIEL_</w:t>
             </w:r>
           </w:p>
+          <w:p>
+            <w:pPr>
+              <w:pStyle w:val="Normal"/>
+              <w:widowControl w:val="false"/>
+              <w:suppressAutoHyphens w:val="true"/>
+              <w:spacing w:lineRule="auto" w:line="240" w:before="0" w:after="0"/>
+              <w:jc w:val="left"/>
+              <w:rPr>
+                <w:sz w:val="22"/>
+                <w:szCs w:val="22"/>
+              </w:rPr>
+            </w:pPr>
+            <w:r>
+              <w:rPr>
+                <w:sz w:val="22"/>
+                <w:szCs w:val="22"/>
+              </w:rPr>
+            </w:r>
+          </w:p>
         </w:tc>
       </w:tr>
       <w:tr>
-        <w:trPr>
-          <w:trHeight w:val="495" w:hRule="atLeast"/>
-        </w:trPr>
+        <w:trPr/>
+        <w:tc>
+          <w:tcPr>
+            <w:tcW w:w="2267" w:type="dxa"/>
+            <w:tcBorders>
+              <w:top w:val="nil"/>
+              <w:left w:val="nil"/>
+              <w:bottom w:val="nil"/>
+              <w:right w:val="nil"/>
+            </w:tcBorders>
+          </w:tcPr>
+          <w:p>
+            <w:pPr>
+              <w:pStyle w:val="Notedebasdepage"/>
+              <w:widowControl w:val="false"/>
+              <w:suppressAutoHyphens w:val="true"/>
+              <w:spacing w:lineRule="auto" w:line="240" w:before="0" w:after="0"/>
+              <w:jc w:val="left"/>
+              <w:rPr>
+                <w:rFonts w:ascii="Times New Roman" w:hAnsi="Times New Roman"/>
+                <w:b/>
+                <w:b/>
+                <w:bCs/>
+                <w:sz w:val="22"/>
+                <w:szCs w:val="22"/>
+                <w:lang w:val="fr-CH"/>
+              </w:rPr>
+            </w:pPr>
+            <w:r>
+              <w:rPr>
+                <w:b/>
+                <w:bCs/>
+                <w:sz w:val="22"/>
+                <w:szCs w:val="22"/>
+                <w:lang w:val="fr-CH"/>
+              </w:rPr>
+              <w:t>Base de données de résistance :</w:t>
+            </w:r>
+          </w:p>
+        </w:tc>
+        <w:tc>
+          <w:tcPr>
+            <w:tcW w:w="1985" w:type="dxa"/>
+            <w:tcBorders>
+              <w:top w:val="nil"/>
+              <w:left w:val="nil"/>
+              <w:bottom w:val="nil"/>
+              <w:right w:val="nil"/>
+            </w:tcBorders>
+          </w:tcPr>
+          <w:p>
+            <w:pPr>
+              <w:pStyle w:val="Normal"/>
+              <w:widowControl w:val="false"/>
+              <w:suppressAutoHyphens w:val="true"/>
+              <w:spacing w:lineRule="auto" w:line="240" w:before="0" w:after="0"/>
+              <w:jc w:val="left"/>
+              <w:rPr>
+                <w:b/>
+                <w:b/>
+                <w:bCs/>
+                <w:sz w:val="22"/>
+                <w:szCs w:val="22"/>
+              </w:rPr>
+            </w:pPr>
+            <w:r>
+              <w:rPr>
+                <w:rStyle w:val="Textesource"/>
+                <w:b w:val="false"/>
+                <w:bCs w:val="false"/>
+                <w:sz w:val="22"/>
+                <w:szCs w:val="22"/>
+              </w:rPr>
+              <w:t>_DATABASE_</w:t>
+            </w:r>
+          </w:p>
+        </w:tc>
+        <w:tc>
+          <w:tcPr>
+            <w:tcW w:w="1844" w:type="dxa"/>
+            <w:tcBorders>
+              <w:top w:val="nil"/>
+              <w:left w:val="nil"/>
+              <w:bottom w:val="nil"/>
+              <w:right w:val="nil"/>
+            </w:tcBorders>
+          </w:tcPr>
+          <w:p>
+            <w:pPr>
+              <w:pStyle w:val="Notedebasdepage"/>
+              <w:widowControl w:val="false"/>
+              <w:suppressAutoHyphens w:val="true"/>
+              <w:spacing w:lineRule="auto" w:line="240" w:before="0" w:after="0"/>
+              <w:jc w:val="left"/>
+              <w:rPr>
+                <w:lang w:val="fr-CH"/>
+              </w:rPr>
+            </w:pPr>
+            <w:r>
+              <w:rPr>
+                <w:rStyle w:val="Accentuationforte"/>
+                <w:sz w:val="22"/>
+                <w:szCs w:val="22"/>
+                <w:lang w:val="fr-CH"/>
+              </w:rPr>
+              <w:t>Numéro d’analyse :</w:t>
+            </w:r>
+            <w:r>
+              <w:rPr>
+                <w:sz w:val="22"/>
+                <w:szCs w:val="22"/>
+                <w:lang w:val="fr-CH"/>
+              </w:rPr>
+              <w:t xml:space="preserve"> </w:t>
+            </w:r>
+          </w:p>
+        </w:tc>
+        <w:tc>
+          <w:tcPr>
+            <w:tcW w:w="2835" w:type="dxa"/>
+            <w:tcBorders>
+              <w:top w:val="nil"/>
+              <w:left w:val="nil"/>
+              <w:bottom w:val="nil"/>
+              <w:right w:val="nil"/>
+            </w:tcBorders>
+          </w:tcPr>
+          <w:p>
+            <w:pPr>
+              <w:pStyle w:val="Notedebasdepage"/>
+              <w:widowControl w:val="false"/>
+              <w:suppressAutoHyphens w:val="true"/>
+              <w:spacing w:lineRule="auto" w:line="240" w:before="0" w:after="0"/>
+              <w:jc w:val="left"/>
+              <w:rPr>
+                <w:sz w:val="22"/>
+                <w:szCs w:val="22"/>
+                <w:lang w:val="fr-CH"/>
+              </w:rPr>
+            </w:pPr>
+            <w:r>
+              <w:rPr>
+                <w:rStyle w:val="Textesource"/>
+                <w:sz w:val="22"/>
+                <w:szCs w:val="22"/>
+                <w:lang w:val="fr-CH"/>
+              </w:rPr>
+              <w:t>_ANALYSISNUMBER_</w:t>
+            </w:r>
+          </w:p>
+        </w:tc>
+      </w:tr>
+      <w:tr>
+        <w:trPr/>
+        <w:tc>
+          <w:tcPr>
+            <w:tcW w:w="2267" w:type="dxa"/>
+            <w:tcBorders>
+              <w:top w:val="nil"/>
+              <w:left w:val="nil"/>
+              <w:bottom w:val="nil"/>
+              <w:right w:val="nil"/>
+            </w:tcBorders>
+          </w:tcPr>
+          <w:p>
+            <w:pPr>
+              <w:pStyle w:val="Notedebasdepage"/>
+              <w:widowControl w:val="false"/>
+              <w:suppressAutoHyphens w:val="true"/>
+              <w:spacing w:lineRule="auto" w:line="240" w:before="0" w:after="0"/>
+              <w:jc w:val="left"/>
+              <w:rPr>
+                <w:sz w:val="16"/>
+                <w:szCs w:val="16"/>
+              </w:rPr>
+            </w:pPr>
+            <w:r>
+              <w:rPr>
+                <w:b/>
+                <w:bCs/>
+                <w:sz w:val="16"/>
+                <w:szCs w:val="16"/>
+                <w:lang w:val="fr-CH"/>
+              </w:rPr>
+              <w:t>Empreinte cryptographique (SHA-256) du conteneur :</w:t>
+            </w:r>
+          </w:p>
+        </w:tc>
+        <w:tc>
+          <w:tcPr>
+            <w:tcW w:w="6664" w:type="dxa"/>
+            <w:gridSpan w:val="3"/>
+            <w:tcBorders>
+              <w:top w:val="nil"/>
+              <w:left w:val="nil"/>
+              <w:bottom w:val="nil"/>
+              <w:right w:val="nil"/>
+            </w:tcBorders>
+          </w:tcPr>
+          <w:p>
+            <w:pPr>
+              <w:pStyle w:val="Normal"/>
+              <w:widowControl w:val="false"/>
+              <w:suppressAutoHyphens w:val="true"/>
+              <w:spacing w:lineRule="auto" w:line="240" w:before="0" w:after="0"/>
+              <w:jc w:val="left"/>
+              <w:rPr>
+                <w:rFonts w:ascii="TlwgTypewriter" w:hAnsi="TlwgTypewriter"/>
+                <w:color w:val="000000"/>
+                <w:sz w:val="16"/>
+                <w:szCs w:val="16"/>
+              </w:rPr>
+            </w:pPr>
+            <w:r>
+              <w:rPr>
+                <w:rFonts w:ascii="TlwgTypewriter" w:hAnsi="TlwgTypewriter"/>
+                <w:b w:val="false"/>
+                <w:i w:val="false"/>
+                <w:color w:val="000000"/>
+                <w:sz w:val="16"/>
+                <w:szCs w:val="16"/>
+              </w:rPr>
+              <w:t>_EMPREINTE_</w:t>
+            </w:r>
+          </w:p>
+          <w:p>
+            <w:pPr>
+              <w:pStyle w:val="Normal"/>
+              <w:widowControl w:val="false"/>
+              <w:suppressAutoHyphens w:val="true"/>
+              <w:spacing w:lineRule="auto" w:line="240" w:before="0" w:after="0"/>
+              <w:jc w:val="left"/>
+              <w:rPr>
+                <w:b w:val="false"/>
+                <w:b w:val="false"/>
+                <w:bCs w:val="false"/>
+                <w:sz w:val="22"/>
+                <w:szCs w:val="22"/>
+              </w:rPr>
+            </w:pPr>
+            <w:r>
+              <w:rPr>
+                <w:b w:val="false"/>
+                <w:bCs w:val="false"/>
+                <w:sz w:val="22"/>
+                <w:szCs w:val="22"/>
+              </w:rPr>
+            </w:r>
+          </w:p>
+        </w:tc>
+      </w:tr>
+      <w:tr>
+        <w:trPr/>
         <w:tc>
           <w:tcPr>
             <w:tcW w:w="2267" w:type="dxa"/>
@@ -505,19 +766,35 @@
             </w:pPr>
             <w:r>
               <w:rPr>
+                <w:rStyle w:val="Accentuationforte"/>
                 <w:b/>
                 <w:bCs/>
                 <w:sz w:val="16"/>
                 <w:szCs w:val="16"/>
                 <w:lang w:val="fr-CH"/>
               </w:rPr>
-              <w:t>Empreinte cryptographique (SHA-256) du conteneur :</w:t>
+              <w:t xml:space="preserve">Empreinte cryptographique (SHA-256) </w:t>
+            </w:r>
+            <w:r>
+              <w:rPr>
+                <w:rStyle w:val="Accentuationforte"/>
+                <w:sz w:val="16"/>
+                <w:szCs w:val="16"/>
+              </w:rPr>
+              <w:t>de la base de données :</w:t>
+            </w:r>
+            <w:r>
+              <w:rPr>
+                <w:sz w:val="16"/>
+                <w:szCs w:val="16"/>
+              </w:rPr>
+              <w:t xml:space="preserve"> </w:t>
             </w:r>
           </w:p>
         </w:tc>
         <w:tc>
           <w:tcPr>
-            <w:tcW w:w="6663" w:type="dxa"/>
+            <w:tcW w:w="6664" w:type="dxa"/>
             <w:gridSpan w:val="3"/>
             <w:tcBorders>
               <w:top w:val="nil"/>
@@ -527,7 +804,7 @@
           </w:tcPr>
           <w:p>
             <w:pPr>
-              <w:pStyle w:val="Normal"/>
+              <w:pStyle w:val="Notedebasdepage"/>
               <w:widowControl w:val="false"/>
               <w:suppressAutoHyphens w:val="true"/>
               <w:spacing w:lineRule="auto" w:line="240" w:before="0" w:after="0"/>
@@ -541,38 +818,13 @@
             </w:pPr>
             <w:r>
               <w:rPr>
+                <w:rStyle w:val="Textesource"/>
                 <w:rFonts w:ascii="TlwgTypewriter" w:hAnsi="TlwgTypewriter"/>
-                <w:b w:val="false"/>
-                <w:i w:val="false"/>
                 <w:color w:val="000000"/>
                 <w:sz w:val="16"/>
                 <w:szCs w:val="16"/>
               </w:rPr>
-              <w:t>_EMPREINTE_</w:t>
-            </w:r>
-          </w:p>
-          <w:p>
-            <w:pPr>
-              <w:pStyle w:val="Normal"/>
-              <w:widowControl w:val="false"/>
-              <w:suppressAutoHyphens w:val="true"/>
-              <w:spacing w:lineRule="auto" w:line="240" w:before="0" w:after="0"/>
-              <w:jc w:val="left"/>
-              <w:rPr>
-                <w:b w:val="false"/>
-                <w:b w:val="false"/>
-                <w:bCs w:val="false"/>
-                <w:sz w:val="22"/>
-                <w:szCs w:val="22"/>
-              </w:rPr>
-            </w:pPr>
-            <w:r>
-              <w:rPr>
-                <w:b w:val="false"/>
-                <w:bCs w:val="false"/>
-                <w:sz w:val="22"/>
-                <w:szCs w:val="22"/>
-              </w:rPr>
+              <w:t>_DBEMPREINTE_</w:t>
             </w:r>
           </w:p>
         </w:tc>
@@ -580,24 +832,13 @@
     </w:tbl>
     <w:p>
       <w:pPr>
-        <w:pStyle w:val="Normal"/>
+        <w:pStyle w:val="Titre2"/>
+        <w:rPr>
+          <w:lang w:val="fr-CH"/>
+        </w:rPr>
+      </w:pPr>
+      <w:r>
         <w:rPr/>
-      </w:pPr>
-      <w:r>
-        <w:rPr/>
-      </w:r>
-    </w:p>
-    <w:p>
-      <w:pPr>
-        <w:pStyle w:val="Normal"/>
-        <w:rPr>
-          <w:lang w:val="fr-CH"/>
-        </w:rPr>
-      </w:pPr>
-      <w:r>
-        <w:rPr>
-          <w:lang w:val="fr-CH"/>
-        </w:rPr>
       </w:r>
     </w:p>
     <w:p>
@@ -616,8 +857,8 @@
         </w:rPr>
         <w:t>Résultat du séquençage du gène UL</w:t>
       </w:r>
-      <w:bookmarkStart w:id="0" w:name="_Ref170228463"/>
-      <w:bookmarkStart w:id="1" w:name="_Ref170228208"/>
+      <w:bookmarkStart w:id="0" w:name="_Ref170228208"/>
+      <w:bookmarkStart w:id="1" w:name="_Ref170228463"/>
       <w:bookmarkEnd w:id="0"/>
       <w:bookmarkEnd w:id="1"/>
       <w:r>
@@ -654,7 +895,9 @@
         </w:rPr>
       </w:pPr>
       <w:r>
-        <w:rPr/>
+        <w:rPr>
+          <w:lang w:val="fr-CH"/>
+        </w:rPr>
       </w:r>
     </w:p>
     <w:p>
@@ -673,8 +916,8 @@
         </w:rPr>
         <w:t>Résultat du séquençage du gène UL</w:t>
       </w:r>
-      <w:bookmarkStart w:id="2" w:name="_Ref17022820811"/>
-      <w:bookmarkStart w:id="3" w:name="_Ref17022846311"/>
+      <w:bookmarkStart w:id="2" w:name="_Ref17022846311"/>
+      <w:bookmarkStart w:id="3" w:name="_Ref17022820811"/>
       <w:bookmarkEnd w:id="2"/>
       <w:bookmarkEnd w:id="3"/>
       <w:r>
@@ -765,7 +1008,9 @@
         </w:rPr>
       </w:pPr>
       <w:r>
-        <w:rPr/>
+        <w:rPr>
+          <w:lang w:val="fr-CH"/>
+        </w:rPr>
       </w:r>
     </w:p>
     <w:p>
@@ -784,8 +1029,8 @@
         </w:rPr>
         <w:t>Résultat du séquençage du gène UL</w:t>
       </w:r>
-      <w:bookmarkStart w:id="4" w:name="_Ref1702282081"/>
-      <w:bookmarkStart w:id="5" w:name="_Ref1702284631"/>
+      <w:bookmarkStart w:id="4" w:name="_Ref1702284631"/>
+      <w:bookmarkStart w:id="5" w:name="_Ref1702282081"/>
       <w:bookmarkEnd w:id="4"/>
       <w:bookmarkEnd w:id="5"/>
       <w:r>
@@ -2392,6 +2637,21 @@
     <w:qFormat/>
     <w:rPr/>
   </w:style>
+  <w:style w:type="character" w:styleId="Textesource">
+    <w:name w:val="Texte source"/>
+    <w:qFormat/>
+    <w:rPr>
+      <w:rFonts w:ascii="Liberation Mono" w:hAnsi="Liberation Mono" w:eastAsia="Liberation Mono" w:cs="Liberation Mono"/>
+    </w:rPr>
+  </w:style>
+  <w:style w:type="character" w:styleId="Accentuationforte">
+    <w:name w:val="Accentuation forte"/>
+    <w:qFormat/>
+    <w:rPr>
+      <w:b/>
+      <w:bCs/>
+    </w:rPr>
+  </w:style>
   <w:style w:type="paragraph" w:styleId="Titre">
     <w:name w:val="Titre"/>
     <w:basedOn w:val="Normal"/>

</xml_diff>